<commit_message>
Actualizar contrato: renta 750 €, entrada 1 sept 2026 y cláusula de reserva
Renta y fianza pasan de 770 € a 750 €; el pago mensual se fija entre los
días 1 y 10 del mes en curso; se añade la cláusula decimotercera de
observaciones (reserva con el pago del mes de agosto de 2026 y entrada en
la vivienda el 1 de septiembre de 2026, fin del contrato 31 de julio de
2027).

Co-Authored-By: Claude Fable 5 <noreply@anthropic.com>
Claude-Session: https://claude.ai/code/session_01F39fS2i9t4afJptzrx8Dpe
</commit_message>
<xml_diff>
--- a/contratos/contrato-alquiler-nueve-de-mayo-24-oviedo.docx
+++ b/contratos/contrato-alquiler-nueve-de-mayo-24-oviedo.docx
@@ -398,7 +398,7 @@
         <w:rPr>
           <w:b/>
         </w:rPr>
-        <w:t>____ de ____________ de 2026</w:t>
+        <w:t>1 de septiembre de 2026</w:t>
       </w:r>
       <w:r>
         <w:rPr>
@@ -410,7 +410,7 @@
         <w:rPr>
           <w:b/>
         </w:rPr>
-        <w:t>____ de ____________ de 202__</w:t>
+        <w:t>31 de julio de 2027</w:t>
       </w:r>
       <w:r>
         <w:rPr>
@@ -487,7 +487,7 @@
         <w:rPr>
           <w:b/>
         </w:rPr>
-        <w:t>SETECIENTOS SETENTA EUROS (770 €) mensuales</w:t>
+        <w:t>SETECIENTOS CINCUENTA EUROS (750 €) mensuales</w:t>
       </w:r>
       <w:r>
         <w:rPr>
@@ -504,13 +504,13 @@
         <w:rPr>
           <w:b w:val="0"/>
         </w:rPr>
-        <w:t xml:space="preserve">El pago se efectuará por meses anticipados, dentro de los </w:t>
+        <w:t xml:space="preserve">El pago se efectuará cada mes, </w:t>
       </w:r>
       <w:r>
         <w:rPr>
           <w:b/>
         </w:rPr>
-        <w:t>cinco primeros días de cada mes</w:t>
+        <w:t>entre los días 1 y 10 del mes en curso</w:t>
       </w:r>
       <w:r>
         <w:rPr>
@@ -589,7 +589,7 @@
         <w:rPr>
           <w:b/>
         </w:rPr>
-        <w:t>SETECIENTOS SETENTA EUROS (770 €)</w:t>
+        <w:t>SETECIENTOS CINCUENTA EUROS (750 €)</w:t>
       </w:r>
       <w:r>
         <w:rPr>
@@ -884,6 +884,108 @@
           <w:b w:val="0"/>
         </w:rPr>
         <w:t>, lugar donde radica la vivienda arrendada.</w:t>
+      </w:r>
+    </w:p>
+    <w:p>
+      <w:r>
+        <w:rPr>
+          <w:b/>
+          <w:sz w:val="24"/>
+        </w:rPr>
+        <w:t>DECIMOTERCERA — Observaciones: reserva, mes de agosto y entrada</w:t>
+      </w:r>
+    </w:p>
+    <w:p>
+      <w:pPr>
+        <w:jc w:val="both"/>
+      </w:pPr>
+      <w:r>
+        <w:rPr>
+          <w:b w:val="0"/>
+        </w:rPr>
+        <w:t xml:space="preserve">En concepto de </w:t>
+      </w:r>
+      <w:r>
+        <w:rPr>
+          <w:b/>
+        </w:rPr>
+        <w:t>reserva</w:t>
+      </w:r>
+      <w:r>
+        <w:rPr>
+          <w:b w:val="0"/>
+        </w:rPr>
+        <w:t xml:space="preserve"> de la vivienda, la arrendataria abona en este acto la renta correspondiente al </w:t>
+      </w:r>
+      <w:r>
+        <w:rPr>
+          <w:b/>
+        </w:rPr>
+        <w:t>mes de agosto de 2026 (750 €)</w:t>
+      </w:r>
+      <w:r>
+        <w:rPr>
+          <w:b w:val="0"/>
+        </w:rPr>
+        <w:t>, quedando la vivienda reservada a su favor durante dicho mes.</w:t>
+      </w:r>
+    </w:p>
+    <w:p>
+      <w:pPr>
+        <w:jc w:val="both"/>
+      </w:pPr>
+      <w:r>
+        <w:rPr>
+          <w:b w:val="0"/>
+        </w:rPr>
+        <w:t xml:space="preserve">La </w:t>
+      </w:r>
+      <w:r>
+        <w:rPr>
+          <w:b/>
+        </w:rPr>
+        <w:t>entrada en la vivienda</w:t>
+      </w:r>
+      <w:r>
+        <w:rPr>
+          <w:b w:val="0"/>
+        </w:rPr>
+        <w:t xml:space="preserve"> se producirá el </w:t>
+      </w:r>
+      <w:r>
+        <w:rPr>
+          <w:b/>
+        </w:rPr>
+        <w:t>1 de septiembre de 2026</w:t>
+      </w:r>
+      <w:r>
+        <w:rPr>
+          <w:b w:val="0"/>
+        </w:rPr>
+        <w:t>, fecha de inicio del contrato, en la que la arrendataria abonará igualmente la mensualidad de septiembre.</w:t>
+      </w:r>
+    </w:p>
+    <w:p>
+      <w:pPr>
+        <w:jc w:val="both"/>
+      </w:pPr>
+      <w:r>
+        <w:rPr>
+          <w:b w:val="0"/>
+        </w:rPr>
+        <w:t xml:space="preserve">A partir de entonces, la renta se abonará </w:t>
+      </w:r>
+      <w:r>
+        <w:rPr>
+          <w:b/>
+        </w:rPr>
+        <w:t>cada mes entre los días 1 y 10 del mes en curso</w:t>
+      </w:r>
+      <w:r>
+        <w:rPr>
+          <w:b w:val="0"/>
+        </w:rPr>
+        <w:t>, conforme a la Cláusula Tercera.</w:t>
       </w:r>
     </w:p>
     <w:p/>

</xml_diff>

<commit_message>
Incorporar inventario real de la vivienda al Anexo I del contrato
Se sustituye la tabla de inventario en blanco por el inventario detallado
facilitado en PDF (balcón, comedor/cocina, salón, habitación y mando de
garaje) y se precisa la dirección de la vivienda: 3º izquierda, C.P.
33002, Oviedo.

Co-Authored-By: Claude Fable 5 <noreply@anthropic.com>
Claude-Session: https://claude.ai/code/session_01F39fS2i9t4afJptzrx8Dpe
</commit_message>
<xml_diff>
--- a/contratos/contrato-alquiler-nueve-de-mayo-24-oviedo.docx
+++ b/contratos/contrato-alquiler-nueve-de-mayo-24-oviedo.docx
@@ -244,7 +244,7 @@
         <w:rPr>
           <w:b/>
         </w:rPr>
-        <w:t>Calle Nueve de Mayo, nº 24, planta 3ª, Oviedo (Asturias)</w:t>
+        <w:t>Calle Nueve de Mayo, nº 24, 3º izquierda, 33002 Oviedo (Asturias)</w:t>
       </w:r>
       <w:r>
         <w:rPr>
@@ -1178,6 +1178,12 @@
       </w:pPr>
       <w:r>
         <w:rPr>
+          <w:b/>
+        </w:rPr>
+        <w:t xml:space="preserve">Piso Calle Nueve de Mayo, 3º izda., 33002 Oviedo. </w:t>
+      </w:r>
+      <w:r>
+        <w:rPr>
           <w:b w:val="0"/>
         </w:rPr>
         <w:t>La vivienda se entrega amueblada con los siguientes elementos, que la arrendataria declara recibir en buen estado:</w:t>
@@ -1190,8 +1196,8 @@
         <w:tblLook w:firstColumn="1" w:firstRow="1" w:lastColumn="0" w:lastRow="0" w:noHBand="0" w:noVBand="1" w:val="04A0"/>
       </w:tblPr>
       <w:tblGrid>
-        <w:gridCol w:w="4703"/>
-        <w:gridCol w:w="4703"/>
+        <w:gridCol w:w="1984"/>
+        <w:gridCol w:w="7087"/>
       </w:tblGrid>
       <w:tr>
         <w:tc>
@@ -1202,6 +1208,7 @@
             <w:r>
               <w:rPr>
                 <w:b/>
+                <w:sz w:val="20"/>
               </w:rPr>
               <w:t>Estancia</w:t>
             </w:r>
@@ -1215,6 +1222,7 @@
             <w:r>
               <w:rPr>
                 <w:b/>
+                <w:sz w:val="20"/>
               </w:rPr>
               <w:t>Elementos</w:t>
             </w:r>
@@ -1228,7 +1236,10 @@
           </w:tcPr>
           <w:p>
             <w:r>
-              <w:t>Salón</w:t>
+              <w:rPr>
+                <w:sz w:val="20"/>
+              </w:rPr>
+              <w:t>Balcón</w:t>
             </w:r>
           </w:p>
         </w:tc>
@@ -1237,7 +1248,12 @@
             <w:tcW w:type="dxa" w:w="4703"/>
           </w:tcPr>
           <w:p>
-            <w:r/>
+            <w:r>
+              <w:rPr>
+                <w:sz w:val="20"/>
+              </w:rPr>
+              <w:t>Mesa y dos sillas de madera. Lavadora/secadora Indesit. Tendal plegable.</w:t>
+            </w:r>
           </w:p>
         </w:tc>
       </w:tr>
@@ -1248,7 +1264,10 @@
           </w:tcPr>
           <w:p>
             <w:r>
-              <w:t>Cocina</w:t>
+              <w:rPr>
+                <w:sz w:val="20"/>
+              </w:rPr>
+              <w:t>Comedor / Cocina</w:t>
             </w:r>
           </w:p>
         </w:tc>
@@ -1257,7 +1276,12 @@
             <w:tcW w:type="dxa" w:w="4703"/>
           </w:tcPr>
           <w:p>
-            <w:r/>
+            <w:r>
+              <w:rPr>
+                <w:sz w:val="20"/>
+              </w:rPr>
+              <w:t>Equipada con mesa de cristal, dos sillas y 2 taburetes, estantería de madera, mueble Ikea y carrito pequeño de madera. Microondas, nevera, vitrocerámica, cafetera. Menaje de cocina: 6 vasos de cristal; juego de 4 boles y 4 platos llanos grandes y pequeños de cerámica color crema; 4 tazas de cerámica; juego de 4 vasos, 4 boles y cuatro platos de plástico duro color crema; 3 boles de cocina de metal; 1 wok de metal; juego de utensilios de cocina; cacitos de medir; tabla de cortar; 1 sartén grande con tapa de cristal; cazo y sartén de teflón; juego de cazo, olla grande y mediana de acero con tapa de cristal; cubo de basura eléctrico; recogedor, escoba y fregona; cubo de fregar; escurreplatos; tres cuchillos de cocina; cubiertos para 6 personas de metal; cubiertos de plástico duro para cuatro personas; ventilador pequeño.</w:t>
+            </w:r>
           </w:p>
         </w:tc>
       </w:tr>
@@ -1268,7 +1292,10 @@
           </w:tcPr>
           <w:p>
             <w:r>
-              <w:t>Dormitorio(s)</w:t>
+              <w:rPr>
+                <w:sz w:val="20"/>
+              </w:rPr>
+              <w:t>Salón</w:t>
             </w:r>
           </w:p>
         </w:tc>
@@ -1277,7 +1304,12 @@
             <w:tcW w:type="dxa" w:w="4703"/>
           </w:tcPr>
           <w:p>
-            <w:r/>
+            <w:r>
+              <w:rPr>
+                <w:sz w:val="20"/>
+              </w:rPr>
+              <w:t>Mesa estantería Ikea, televisor, sofá cama, cojín, mesilla, 2 mesitas de centro, alfombra, perchero, banco gris/zapatero.</w:t>
+            </w:r>
           </w:p>
         </w:tc>
       </w:tr>
@@ -1288,7 +1320,10 @@
           </w:tcPr>
           <w:p>
             <w:r>
-              <w:t>Baño</w:t>
+              <w:rPr>
+                <w:sz w:val="20"/>
+              </w:rPr>
+              <w:t>Habitación</w:t>
             </w:r>
           </w:p>
         </w:tc>
@@ -1297,7 +1332,12 @@
             <w:tcW w:type="dxa" w:w="4703"/>
           </w:tcPr>
           <w:p>
-            <w:r/>
+            <w:r>
+              <w:rPr>
+                <w:sz w:val="20"/>
+              </w:rPr>
+              <w:t>Cama doble (1,35 m), 2 almohadas, protector de colchón, armario, mesita blanca de madera, lámpara de madera, cesto para la ropa, espejo de pared, cuadro, cabecero de madera, pequeño ventilador con cargador USB, alfombra amarilla, 10 perchas de madera negra.</w:t>
+            </w:r>
           </w:p>
         </w:tc>
       </w:tr>
@@ -1308,26 +1348,9 @@
           </w:tcPr>
           <w:p>
             <w:r>
-              <w:t>Electrodomésticos</w:t>
-            </w:r>
-          </w:p>
-        </w:tc>
-        <w:tc>
-          <w:tcPr>
-            <w:tcW w:type="dxa" w:w="4703"/>
-          </w:tcPr>
-          <w:p>
-            <w:r/>
-          </w:p>
-        </w:tc>
-      </w:tr>
-      <w:tr>
-        <w:tc>
-          <w:tcPr>
-            <w:tcW w:type="dxa" w:w="4703"/>
-          </w:tcPr>
-          <w:p>
-            <w:r>
+              <w:rPr>
+                <w:sz w:val="20"/>
+              </w:rPr>
               <w:t>Otros</w:t>
             </w:r>
           </w:p>
@@ -1337,7 +1360,12 @@
             <w:tcW w:type="dxa" w:w="4703"/>
           </w:tcPr>
           <w:p>
-            <w:r/>
+            <w:r>
+              <w:rPr>
+                <w:sz w:val="20"/>
+              </w:rPr>
+              <w:t>Mando de garaje.</w:t>
+            </w:r>
           </w:p>
         </w:tc>
       </w:tr>

</xml_diff>

<commit_message>
Cambiar el pago de la fianza de metálico a ingreso en cuenta
La fianza de 750 € (cláusula cuarta) pasa a abonarse mediante ingreso o
transferencia en la cuenta de la arrendadora, con el justificante como
carta de pago.

Co-Authored-By: Claude Fable 5 <noreply@anthropic.com>
Claude-Session: https://claude.ai/code/session_01F39fS2i9t4afJptzrx8Dpe
</commit_message>
<xml_diff>
--- a/contratos/contrato-alquiler-nueve-de-mayo-24-oviedo.docx
+++ b/contratos/contrato-alquiler-nueve-de-mayo-24-oviedo.docx
@@ -571,19 +571,7 @@
         <w:rPr>
           <w:b w:val="0"/>
         </w:rPr>
-        <w:t xml:space="preserve">A la firma del presente contrato, la arrendataria entrega a la arrendadora, </w:t>
-      </w:r>
-      <w:r>
-        <w:rPr>
-          <w:b/>
-        </w:rPr>
-        <w:t>en metálico</w:t>
-      </w:r>
-      <w:r>
-        <w:rPr>
-          <w:b w:val="0"/>
-        </w:rPr>
-        <w:t xml:space="preserve">, la cantidad de </w:t>
+        <w:t xml:space="preserve">A la firma del presente contrato, la arrendataria entrega a la arrendadora la cantidad de </w:t>
       </w:r>
       <w:r>
         <w:rPr>
@@ -607,7 +595,19 @@
         <w:rPr>
           <w:b w:val="0"/>
         </w:rPr>
-        <w:t xml:space="preserve"> (art. 36 LAU), sirviendo el presente documento como la más eficaz carta de pago.</w:t>
+        <w:t xml:space="preserve"> (art. 36 LAU), mediante </w:t>
+      </w:r>
+      <w:r>
+        <w:rPr>
+          <w:b/>
+        </w:rPr>
+        <w:t>ingreso o transferencia</w:t>
+      </w:r>
+      <w:r>
+        <w:rPr>
+          <w:b w:val="0"/>
+        </w:rPr>
+        <w:t xml:space="preserve"> en la cuenta bancaria de la arrendadora indicada en la Cláusula Tercera, sirviendo el justificante del ingreso como carta de pago.</w:t>
       </w:r>
     </w:p>
     <w:p>

</xml_diff>

<commit_message>
Completar los datos de la arrendataria en el contrato
Se rellenan el nombre y DNI de la inquilina en el encabezamiento y en el
cuadro de firmas, quedando el contrato sin huecos pendientes salvo la
fecha de firma.

Co-Authored-By: Claude Fable 5 <noreply@anthropic.com>
Claude-Session: https://claude.ai/code/session_01F39fS2i9t4afJptzrx8Dpe
</commit_message>
<xml_diff>
--- a/contratos/contrato-alquiler-nueve-de-mayo-24-oviedo.docx
+++ b/contratos/contrato-alquiler-nueve-de-mayo-24-oviedo.docx
@@ -125,19 +125,19 @@
         <w:rPr>
           <w:b/>
         </w:rPr>
-        <w:t>____________________________________________</w:t>
+        <w:t>GLORIA NATHALYN AÑASCO GÓMEZ</w:t>
       </w:r>
       <w:r>
         <w:rPr>
           <w:b w:val="0"/>
         </w:rPr>
-        <w:t xml:space="preserve">, mayor de edad, con D.N.I./N.I.E. nº </w:t>
+        <w:t xml:space="preserve">, mayor de edad, de nacionalidad española, con D.N.I. nº </w:t>
       </w:r>
       <w:r>
         <w:rPr>
           <w:b/>
         </w:rPr>
-        <w:t>________________</w:t>
+        <w:t>70095286-A</w:t>
       </w:r>
       <w:r>
         <w:rPr>
@@ -1132,9 +1132,9 @@
               <w:jc w:val="center"/>
             </w:pPr>
             <w:r>
-              <w:t>Fdo.: ____________________</w:t>
+              <w:t>Fdo.: Gloria N. Añasco Gómez</w:t>
               <w:br/>
-              <w:t>D.N.I./N.I.E. ____________</w:t>
+              <w:t>D.N.I. 70095286-A</w:t>
             </w:r>
           </w:p>
         </w:tc>

</xml_diff>

<commit_message>
Añadir la firma de la avalista al Anexo I del inventario
El bloque de firmas del inventario pasa a incluir a las tres partes:
arrendadora, arrendataria y avalista.

Co-Authored-By: Claude Fable 5 <noreply@anthropic.com>
Claude-Session: https://claude.ai/code/session_01F39fS2i9t4afJptzrx8Dpe
</commit_message>
<xml_diff>
--- a/contratos/contrato-alquiler-nueve-de-mayo-24-oviedo.docx
+++ b/contratos/contrato-alquiler-nueve-de-mayo-24-oviedo.docx
@@ -1383,23 +1383,153 @@
       </w:r>
     </w:p>
     <w:p/>
-    <w:p>
-      <w:r>
-        <w:rPr>
-          <w:b/>
-        </w:rPr>
-        <w:t>La Arrendadora</w:t>
-      </w:r>
-      <w:r>
-        <w:t xml:space="preserve">                                        </w:t>
-      </w:r>
-      <w:r>
-        <w:rPr>
-          <w:b/>
-        </w:rPr>
-        <w:t>La Arrendataria</w:t>
-      </w:r>
-    </w:p>
+    <w:tbl>
+      <w:tblPr>
+        <w:tblStyle w:val="TableGrid"/>
+        <w:tblW w:type="auto" w:w="0"/>
+        <w:tblLook w:firstColumn="1" w:firstRow="1" w:lastColumn="0" w:lastRow="0" w:noHBand="0" w:noVBand="1" w:val="04A0"/>
+      </w:tblPr>
+      <w:tblGrid>
+        <w:gridCol w:w="3135"/>
+        <w:gridCol w:w="3135"/>
+        <w:gridCol w:w="3135"/>
+      </w:tblGrid>
+      <w:tr>
+        <w:tc>
+          <w:tcPr>
+            <w:tcW w:type="dxa" w:w="3135"/>
+          </w:tcPr>
+          <w:p>
+            <w:pPr>
+              <w:jc w:val="center"/>
+            </w:pPr>
+            <w:r/>
+            <w:r>
+              <w:rPr>
+                <w:b/>
+              </w:rPr>
+              <w:t>LA ARRENDADORA</w:t>
+            </w:r>
+          </w:p>
+        </w:tc>
+        <w:tc>
+          <w:tcPr>
+            <w:tcW w:type="dxa" w:w="3135"/>
+          </w:tcPr>
+          <w:p>
+            <w:pPr>
+              <w:jc w:val="center"/>
+            </w:pPr>
+            <w:r/>
+            <w:r>
+              <w:rPr>
+                <w:b/>
+              </w:rPr>
+              <w:t>LA ARRENDATARIA</w:t>
+            </w:r>
+          </w:p>
+        </w:tc>
+        <w:tc>
+          <w:tcPr>
+            <w:tcW w:type="dxa" w:w="3135"/>
+          </w:tcPr>
+          <w:p>
+            <w:pPr>
+              <w:jc w:val="center"/>
+            </w:pPr>
+            <w:r/>
+            <w:r>
+              <w:rPr>
+                <w:b/>
+              </w:rPr>
+              <w:t>LA AVALISTA</w:t>
+            </w:r>
+          </w:p>
+        </w:tc>
+      </w:tr>
+      <w:tr>
+        <w:tc>
+          <w:tcPr>
+            <w:tcW w:type="dxa" w:w="3135"/>
+          </w:tcPr>
+          <w:p>
+            <w:r>
+              <w:br/>
+              <w:br/>
+              <w:br/>
+              <w:br/>
+            </w:r>
+          </w:p>
+        </w:tc>
+        <w:tc>
+          <w:tcPr>
+            <w:tcW w:type="dxa" w:w="3135"/>
+          </w:tcPr>
+          <w:p>
+            <w:r>
+              <w:br/>
+              <w:br/>
+              <w:br/>
+              <w:br/>
+            </w:r>
+          </w:p>
+        </w:tc>
+        <w:tc>
+          <w:tcPr>
+            <w:tcW w:type="dxa" w:w="3135"/>
+          </w:tcPr>
+          <w:p>
+            <w:r>
+              <w:br/>
+              <w:br/>
+              <w:br/>
+              <w:br/>
+            </w:r>
+          </w:p>
+        </w:tc>
+      </w:tr>
+      <w:tr>
+        <w:tc>
+          <w:tcPr>
+            <w:tcW w:type="dxa" w:w="3135"/>
+          </w:tcPr>
+          <w:p>
+            <w:pPr>
+              <w:jc w:val="center"/>
+            </w:pPr>
+            <w:r>
+              <w:t>Fdo.: Patricia Ordás Pardo</w:t>
+            </w:r>
+          </w:p>
+        </w:tc>
+        <w:tc>
+          <w:tcPr>
+            <w:tcW w:type="dxa" w:w="3135"/>
+          </w:tcPr>
+          <w:p>
+            <w:pPr>
+              <w:jc w:val="center"/>
+            </w:pPr>
+            <w:r>
+              <w:t>Fdo.: Gloria N. Añasco Gómez</w:t>
+            </w:r>
+          </w:p>
+        </w:tc>
+        <w:tc>
+          <w:tcPr>
+            <w:tcW w:type="dxa" w:w="3135"/>
+          </w:tcPr>
+          <w:p>
+            <w:pPr>
+              <w:jc w:val="center"/>
+            </w:pPr>
+            <w:r>
+              <w:t>Fdo.: Derianyelis A. Sarmiento Ramírez</w:t>
+            </w:r>
+          </w:p>
+        </w:tc>
+      </w:tr>
+    </w:tbl>
     <w:p/>
     <w:p/>
     <w:p>

</xml_diff>